<commit_message>
Update Sverdlovskaya sample contract to ООО «Счастье».
</commit_message>
<xml_diff>
--- a/documents/dogovor_sverdlovskaya.docx
+++ b/documents/dogovor_sverdlovskaya.docx
@@ -824,7 +824,7 @@
           <w:szCs w:val="22"/>
           <w:lang w:val="ru-RU"/>
         </w:rPr>
-        <w:t xml:space="preserve"> «   » апрель 2026</w:t>
+        <w:t xml:space="preserve"> «   »                 2026</w:t>
       </w:r>
       <w:r>
         <w:rPr>
@@ -867,51 +867,51 @@
           <w:highlight w:val="white"/>
           <w:lang w:val="ru-RU"/>
         </w:rPr>
-        <w:t>ИП Краковский Константин Николаевич, именуемый</w:t>
-      </w:r>
-      <w:r>
-        <w:rPr>
-          <w:rFonts w:ascii="Times New Roman" w:hAnsi="Times New Roman"/>
-          <w:color w:val="000000"/>
-          <w:sz w:val="24"/>
-          <w:szCs w:val="24"/>
-          <w:highlight w:val="white"/>
-          <w:lang w:val="ru-RU"/>
-        </w:rPr>
-        <w:t xml:space="preserve"> в дальнейшем «Исполнитель», в лице </w:t>
-      </w:r>
-      <w:r>
-        <w:rPr>
-          <w:rFonts w:ascii="Times New Roman" w:hAnsi="Times New Roman"/>
-          <w:color w:val="000000"/>
-          <w:sz w:val="24"/>
-          <w:szCs w:val="24"/>
-          <w:highlight w:val="white"/>
-          <w:lang w:val="ru-RU"/>
-        </w:rPr>
-        <w:t>Краковского Константина Николаевича</w:t>
-      </w:r>
-      <w:r>
-        <w:rPr>
-          <w:rFonts w:ascii="Times New Roman" w:hAnsi="Times New Roman"/>
-          <w:color w:val="000000"/>
-          <w:sz w:val="24"/>
-          <w:szCs w:val="24"/>
-          <w:highlight w:val="white"/>
-          <w:lang w:val="ru-RU"/>
-        </w:rPr>
-        <w:t>, с одной стороны и</w:t>
-      </w:r>
-      <w:r>
-        <w:rPr>
-          <w:rFonts w:ascii="Times New Roman" w:hAnsi="Times New Roman"/>
-          <w:sz w:val="24"/>
-          <w:szCs w:val="24"/>
-          <w:highlight w:val="white"/>
-          <w:u w:val="single"/>
-          <w:lang w:val="ru-RU"/>
-        </w:rPr>
-        <w:t xml:space="preserve">                                                                             </w:t>
+        <w:t>Общество с ограниченной ответственностью «Счастье» в лице генерального директора Романенко Татьяны Анатольевны, действующей на основании Устава,  именуемый</w:t>
+      </w:r>
+      <w:r>
+        <w:rPr>
+          <w:rFonts w:ascii="Times New Roman" w:hAnsi="Times New Roman"/>
+          <w:color w:val="000000"/>
+          <w:sz w:val="24"/>
+          <w:szCs w:val="24"/>
+          <w:highlight w:val="white"/>
+          <w:lang w:val="ru-RU"/>
+        </w:rPr>
+        <w:t xml:space="preserve"> в </w:t>
+      </w:r>
+      <w:r>
+        <w:rPr>
+          <w:rFonts w:ascii="Times New Roman" w:hAnsi="Times New Roman"/>
+          <w:color w:val="000000"/>
+          <w:sz w:val="24"/>
+          <w:szCs w:val="24"/>
+          <w:highlight w:val="white"/>
+          <w:lang w:val="ru-RU"/>
+        </w:rPr>
+        <w:t xml:space="preserve">дальнейшем «Исполнитель», </w:t>
+      </w:r>
+      <w:r>
+        <w:rPr>
+          <w:rFonts w:ascii="Times New Roman" w:hAnsi="Times New Roman"/>
+          <w:color w:val="000000"/>
+          <w:sz w:val="24"/>
+          <w:szCs w:val="24"/>
+          <w:highlight w:val="white"/>
+          <w:lang w:val="ru-RU"/>
+        </w:rPr>
+        <w:t>с одной стороны и</w:t>
+      </w:r>
+      <w:r>
+        <w:rPr>
+          <w:rFonts w:ascii="Times New Roman" w:hAnsi="Times New Roman"/>
+          <w:sz w:val="24"/>
+          <w:szCs w:val="24"/>
+          <w:highlight w:val="white"/>
+          <w:u w:val="single"/>
+          <w:lang w:val="ru-RU"/>
+        </w:rPr>
+        <w:t xml:space="preserve">                                _____                                             _________________________________________________________________________________________</w:t>
       </w:r>
       <w:r>
         <w:rPr>
@@ -1389,6 +1389,7 @@
           <w:lang w:val="ru-RU"/>
         </w:rPr>
         <w:tab/>
+        <w:t>____________</w:t>
       </w:r>
       <w:r>
         <w:rPr>
@@ -1400,6 +1401,7 @@
           <w:lang w:val="ru-RU"/>
         </w:rPr>
         <w:tab/>
+        <w:t>________________________________</w:t>
       </w:r>
       <w:r>
         <w:rPr>
@@ -1580,7 +1582,7 @@
           <w:lang w:val="ru-RU"/>
         </w:rPr>
         <w:tab/>
-        <w:t>,</w:t>
+        <w:t>___________________________________________________________,</w:t>
       </w:r>
       <w:r>
         <w:rPr>
@@ -1673,7 +1675,7 @@
           <w:highlight w:val="white"/>
           <w:lang w:val="ru-RU"/>
         </w:rPr>
-        <w:t xml:space="preserve">, выдан </w:t>
+        <w:t>, выдан ___________________________________</w:t>
       </w:r>
     </w:p>
     <w:p>
@@ -4366,7 +4368,7 @@
                       <w:highlight w:val="white"/>
                       <w:lang w:val="ru-RU"/>
                     </w:rPr>
-                    <w:t>ИП Краковский КН</w:t>
+                    <w:t>Общество с ограниченной ответственность</w:t>
                   </w:r>
                 </w:p>
                 <w:p>
@@ -4392,29 +4394,7 @@
                       <w:highlight w:val="white"/>
                       <w:lang w:val="ru-RU"/>
                     </w:rPr>
-                    <w:t xml:space="preserve">Адрес: </w:t>
-                  </w:r>
-                  <w:r>
-                    <w:rPr>
-                      <w:rFonts w:ascii="Times New Roman" w:hAnsi="Times New Roman"/>
-                      <w:color w:val="000000"/>
-                      <w:sz w:val="24"/>
-                      <w:szCs w:val="24"/>
-                      <w:highlight w:val="white"/>
-                      <w:lang w:val="ru-RU"/>
-                    </w:rPr>
-                    <w:t>195257</w:t>
-                  </w:r>
-                  <w:r>
-                    <w:rPr>
-                      <w:rFonts w:ascii="Times New Roman" w:hAnsi="Times New Roman"/>
-                      <w:color w:val="000000"/>
-                      <w:sz w:val="24"/>
-                      <w:szCs w:val="24"/>
-                      <w:highlight w:val="white"/>
-                      <w:lang w:val="ru-RU"/>
-                    </w:rPr>
-                    <w:t xml:space="preserve">, Г.Санкт-Петербург,   </w:t>
+                    <w:t>«Счастье», (ООО «Счастье»)</w:t>
                   </w:r>
                 </w:p>
                 <w:p>
@@ -4440,7 +4420,29 @@
                       <w:highlight w:val="white"/>
                       <w:lang w:val="ru-RU"/>
                     </w:rPr>
-                    <w:t>Северный проспект д. 73 к. 3 кв.85</w:t>
+                    <w:t xml:space="preserve">Адрес: </w:t>
+                  </w:r>
+                  <w:r>
+                    <w:rPr>
+                      <w:rFonts w:ascii="Times New Roman" w:hAnsi="Times New Roman"/>
+                      <w:color w:val="000000"/>
+                      <w:sz w:val="24"/>
+                      <w:szCs w:val="24"/>
+                      <w:highlight w:val="white"/>
+                      <w:lang w:val="ru-RU"/>
+                    </w:rPr>
+                    <w:t>194291</w:t>
+                  </w:r>
+                  <w:r>
+                    <w:rPr>
+                      <w:rFonts w:ascii="Times New Roman" w:hAnsi="Times New Roman"/>
+                      <w:color w:val="000000"/>
+                      <w:sz w:val="24"/>
+                      <w:szCs w:val="24"/>
+                      <w:highlight w:val="white"/>
+                      <w:lang w:val="ru-RU"/>
+                    </w:rPr>
+                    <w:t xml:space="preserve">, Г.Санкт-Петербург, </w:t>
                   </w:r>
                 </w:p>
                 <w:p>
@@ -4466,7 +4468,7 @@
                       <w:highlight w:val="white"/>
                       <w:lang w:val="ru-RU"/>
                     </w:rPr>
-                    <w:t xml:space="preserve"> </w:t>
+                    <w:t>Вн. тер. Муниципальный округ Сосновское,</w:t>
                   </w:r>
                 </w:p>
                 <w:p>
@@ -4492,18 +4494,7 @@
                       <w:highlight w:val="white"/>
                       <w:lang w:val="ru-RU"/>
                     </w:rPr>
-                    <w:t xml:space="preserve">ОГРН </w:t>
-                  </w:r>
-                  <w:r>
-                    <w:rPr>
-                      <w:rFonts w:ascii="Times New Roman" w:hAnsi="Times New Roman"/>
-                      <w:color w:val="000000"/>
-                      <w:sz w:val="24"/>
-                      <w:szCs w:val="24"/>
-                      <w:highlight w:val="white"/>
-                      <w:lang w:val="ru-RU"/>
-                    </w:rPr>
-                    <w:t>326784700062470</w:t>
+                    <w:t xml:space="preserve">Улица Сантьяго-де-Куба дом 4, корпус 3, </w:t>
                   </w:r>
                 </w:p>
                 <w:p>
@@ -4529,18 +4520,7 @@
                       <w:highlight w:val="white"/>
                       <w:lang w:val="ru-RU"/>
                     </w:rPr>
-                    <w:t xml:space="preserve">ИНН </w:t>
-                  </w:r>
-                  <w:r>
-                    <w:rPr>
-                      <w:rFonts w:ascii="Times New Roman" w:hAnsi="Times New Roman"/>
-                      <w:color w:val="000000"/>
-                      <w:sz w:val="24"/>
-                      <w:szCs w:val="24"/>
-                      <w:highlight w:val="white"/>
-                      <w:lang w:val="ru-RU"/>
-                    </w:rPr>
-                    <w:t>272423578621</w:t>
+                    <w:t>Литера А.</w:t>
                   </w:r>
                 </w:p>
                 <w:p>
@@ -4566,7 +4546,7 @@
                       <w:highlight w:val="white"/>
                       <w:lang w:val="ru-RU"/>
                     </w:rPr>
-                    <w:t xml:space="preserve">Расчетный счет </w:t>
+                    <w:t>ОГРН</w:t>
                   </w:r>
                   <w:r>
                     <w:rPr>
@@ -4577,7 +4557,7 @@
                       <w:highlight w:val="white"/>
                       <w:lang w:val="ru-RU"/>
                     </w:rPr>
-                    <w:t>40802810300009374388</w:t>
+                    <w:t>1267800064993</w:t>
                   </w:r>
                 </w:p>
                 <w:p>
@@ -4603,7 +4583,7 @@
                       <w:highlight w:val="white"/>
                       <w:lang w:val="ru-RU"/>
                     </w:rPr>
-                    <w:t>Банковские-</w:t>
+                    <w:t xml:space="preserve">ИНН </w:t>
                   </w:r>
                   <w:r>
                     <w:rPr>
@@ -4614,61 +4594,7 @@
                       <w:highlight w:val="white"/>
                       <w:lang w:val="ru-RU"/>
                     </w:rPr>
-                    <w:t>реквизиты:</w:t>
-                  </w:r>
-                  <w:r>
-                    <w:rPr>
-                      <w:rFonts w:ascii="Times New Roman" w:hAnsi="Times New Roman"/>
-                      <w:color w:val="000000"/>
-                      <w:sz w:val="24"/>
-                      <w:szCs w:val="24"/>
-                      <w:highlight w:val="white"/>
-                    </w:rPr>
-                    <w:t> </w:t>
-                  </w:r>
-                  <w:r>
-                    <w:rPr>
-                      <w:rFonts w:ascii="Times New Roman" w:hAnsi="Times New Roman"/>
-                      <w:color w:val="000000"/>
-                      <w:sz w:val="24"/>
-                      <w:szCs w:val="24"/>
-                      <w:highlight w:val="white"/>
-                      <w:lang w:val="ru-RU"/>
-                    </w:rPr>
-                    <w:t>АО</w:t>
-                  </w:r>
-                  <w:r>
-                    <w:rPr>
-                      <w:rFonts w:ascii="Times New Roman" w:hAnsi="Times New Roman"/>
-                      <w:color w:val="000000"/>
-                      <w:sz w:val="24"/>
-                      <w:szCs w:val="24"/>
-                      <w:highlight w:val="white"/>
-                      <w:lang w:val="ru-RU"/>
-                    </w:rPr>
-                    <w:t>«</w:t>
-                  </w:r>
-                  <w:r>
-                    <w:rPr>
-                      <w:rFonts w:ascii="Times New Roman" w:hAnsi="Times New Roman"/>
-                      <w:color w:val="000000"/>
-                      <w:sz w:val="24"/>
-                      <w:szCs w:val="24"/>
-                      <w:highlight w:val="white"/>
-                      <w:lang w:val="ru-RU"/>
-                    </w:rPr>
-                    <w:t>ТБанк</w:t>
-                  </w:r>
-                  <w:r>
-                    <w:rPr>
-                      <w:rFonts w:ascii="Times New Roman" w:hAnsi="Times New Roman"/>
-                      <w:color w:val="000000"/>
-                      <w:sz w:val="24"/>
-                      <w:szCs w:val="24"/>
-                      <w:highlight w:val="white"/>
-                      <w:lang w:val="ru-RU"/>
-                    </w:rPr>
-                    <w:t>»</w:t>
+                    <w:t>7802976248</w:t>
                   </w:r>
                 </w:p>
                 <w:p>
@@ -4694,7 +4620,7 @@
                       <w:highlight w:val="white"/>
                       <w:lang w:val="ru-RU"/>
                     </w:rPr>
-                    <w:t xml:space="preserve">БИК банка </w:t>
+                    <w:t xml:space="preserve">Расчетный счет </w:t>
                   </w:r>
                   <w:r>
                     <w:rPr>
@@ -4705,7 +4631,7 @@
                       <w:highlight w:val="white"/>
                       <w:lang w:val="ru-RU"/>
                     </w:rPr>
-                    <w:t>044525974</w:t>
+                    <w:t>40702810190810030943</w:t>
                   </w:r>
                 </w:p>
                 <w:p>
@@ -4731,6 +4657,101 @@
                       <w:highlight w:val="white"/>
                       <w:lang w:val="ru-RU"/>
                     </w:rPr>
+                    <w:t xml:space="preserve">Банковские - </w:t>
+                  </w:r>
+                  <w:r>
+                    <w:rPr>
+                      <w:rFonts w:ascii="Times New Roman" w:hAnsi="Times New Roman"/>
+                      <w:color w:val="000000"/>
+                      <w:sz w:val="24"/>
+                      <w:szCs w:val="24"/>
+                      <w:highlight w:val="white"/>
+                      <w:lang w:val="ru-RU"/>
+                    </w:rPr>
+                    <w:t>реквизиты:</w:t>
+                  </w:r>
+                  <w:r>
+                    <w:rPr>
+                      <w:rFonts w:ascii="Times New Roman" w:hAnsi="Times New Roman"/>
+                      <w:color w:val="000000"/>
+                      <w:sz w:val="24"/>
+                      <w:szCs w:val="24"/>
+                      <w:highlight w:val="white"/>
+                    </w:rPr>
+                    <w:t> </w:t>
+                  </w:r>
+                  <w:r>
+                    <w:rPr>
+                      <w:rFonts w:ascii="Times New Roman" w:hAnsi="Times New Roman"/>
+                      <w:color w:val="000000"/>
+                      <w:sz w:val="24"/>
+                      <w:szCs w:val="24"/>
+                      <w:highlight w:val="white"/>
+                      <w:lang w:val="ru-RU"/>
+                    </w:rPr>
+                    <w:t>ПАО ВТБ</w:t>
+                  </w:r>
+                </w:p>
+                <w:p>
+                  <w:pPr>
+                    <w:framePr w:hSpace="180" w:wrap="around" w:vAnchor="text" w:hAnchor="text" w:x="815" w:y="211"/>
+                    <w:ind w:right="-600"/>
+                    <w:jc w:val="both"/>
+                    <w:rPr>
+                      <w:rFonts w:ascii="Times New Roman" w:hAnsi="Times New Roman"/>
+                      <w:color w:val="000000"/>
+                      <w:sz w:val="24"/>
+                      <w:szCs w:val="24"/>
+                      <w:highlight w:val="white"/>
+                      <w:lang w:val="ru-RU"/>
+                    </w:rPr>
+                  </w:pPr>
+                  <w:r>
+                    <w:rPr>
+                      <w:rFonts w:ascii="Times New Roman" w:hAnsi="Times New Roman"/>
+                      <w:color w:val="000000"/>
+                      <w:sz w:val="24"/>
+                      <w:szCs w:val="24"/>
+                      <w:highlight w:val="white"/>
+                      <w:lang w:val="ru-RU"/>
+                    </w:rPr>
+                    <w:t xml:space="preserve">БИК банка </w:t>
+                  </w:r>
+                  <w:r>
+                    <w:rPr>
+                      <w:rFonts w:ascii="Times New Roman" w:hAnsi="Times New Roman"/>
+                      <w:color w:val="000000"/>
+                      <w:sz w:val="24"/>
+                      <w:szCs w:val="24"/>
+                      <w:highlight w:val="white"/>
+                      <w:lang w:val="ru-RU"/>
+                    </w:rPr>
+                    <w:t>044525187</w:t>
+                  </w:r>
+                </w:p>
+                <w:p>
+                  <w:pPr>
+                    <w:framePr w:hSpace="180" w:wrap="around" w:vAnchor="text" w:hAnchor="text" w:x="815" w:y="211"/>
+                    <w:ind w:right="-600"/>
+                    <w:jc w:val="both"/>
+                    <w:rPr>
+                      <w:rFonts w:ascii="Times New Roman" w:hAnsi="Times New Roman"/>
+                      <w:color w:val="000000"/>
+                      <w:sz w:val="24"/>
+                      <w:szCs w:val="24"/>
+                      <w:highlight w:val="white"/>
+                      <w:lang w:val="ru-RU"/>
+                    </w:rPr>
+                  </w:pPr>
+                  <w:r>
+                    <w:rPr>
+                      <w:rFonts w:ascii="Times New Roman" w:hAnsi="Times New Roman"/>
+                      <w:color w:val="000000"/>
+                      <w:sz w:val="24"/>
+                      <w:szCs w:val="24"/>
+                      <w:highlight w:val="white"/>
+                      <w:lang w:val="ru-RU"/>
+                    </w:rPr>
                     <w:t xml:space="preserve">ИНН банка </w:t>
                   </w:r>
                   <w:r>
@@ -4742,7 +4763,7 @@
                       <w:highlight w:val="white"/>
                       <w:lang w:val="ru-RU"/>
                     </w:rPr>
-                    <w:t>7710140679</w:t>
+                    <w:t>77020701391</w:t>
                   </w:r>
                 </w:p>
                 <w:p>
@@ -4794,7 +4815,7 @@
                       <w:highlight w:val="white"/>
                       <w:lang w:val="ru-RU"/>
                     </w:rPr>
-                    <w:t>30101810145250000974</w:t>
+                    <w:t>30101810700000000187</w:t>
                   </w:r>
                 </w:p>
                 <w:p>
@@ -4831,7 +4852,7 @@
                       <w:highlight w:val="white"/>
                       <w:lang w:val="ru-RU"/>
                     </w:rPr>
-                    <w:t xml:space="preserve"> 107078, г Москва,</w:t>
+                    <w:t xml:space="preserve"> 191144,</w:t>
                   </w:r>
                 </w:p>
                 <w:p>
@@ -4857,7 +4878,70 @@
                       <w:highlight w:val="white"/>
                       <w:lang w:val="ru-RU"/>
                     </w:rPr>
-                    <w:t>Ул. Хуторская 2-я, д. 38А, стр.26</w:t>
+                    <w:t>Г. Санкт-Петербург,</w:t>
+                  </w:r>
+                </w:p>
+                <w:p>
+                  <w:pPr>
+                    <w:framePr w:hSpace="180" w:wrap="around" w:vAnchor="text" w:hAnchor="text" w:x="815" w:y="211"/>
+                    <w:ind w:right="-600"/>
+                    <w:jc w:val="both"/>
+                    <w:rPr>
+                      <w:rFonts w:ascii="Times New Roman" w:hAnsi="Times New Roman"/>
+                      <w:color w:val="000000"/>
+                      <w:sz w:val="24"/>
+                      <w:szCs w:val="24"/>
+                      <w:highlight w:val="white"/>
+                      <w:lang w:val="ru-RU"/>
+                    </w:rPr>
+                  </w:pPr>
+                  <w:r>
+                    <w:rPr>
+                      <w:rFonts w:ascii="Times New Roman" w:hAnsi="Times New Roman"/>
+                      <w:color w:val="000000"/>
+                      <w:sz w:val="24"/>
+                      <w:szCs w:val="24"/>
+                      <w:highlight w:val="white"/>
+                      <w:lang w:val="ru-RU"/>
+                    </w:rPr>
+                    <w:t>Дектярный переулок, д. 11, лит. А</w:t>
+                  </w:r>
+                </w:p>
+                <w:p>
+                  <w:pPr>
+                    <w:framePr w:hSpace="180" w:wrap="around" w:vAnchor="text" w:hAnchor="text" w:x="815" w:y="211"/>
+                    <w:ind w:right="-600"/>
+                    <w:jc w:val="both"/>
+                    <w:rPr>
+                      <w:rFonts w:ascii="Times New Roman" w:hAnsi="Times New Roman"/>
+                      <w:color w:val="000000"/>
+                      <w:sz w:val="24"/>
+                      <w:szCs w:val="24"/>
+                      <w:highlight w:val="white"/>
+                      <w:lang w:val="ru-RU"/>
+                    </w:rPr>
+                  </w:pPr>
+                  <w:r>
+                    <w:rPr>
+                      <w:rFonts w:ascii="Times New Roman" w:hAnsi="Times New Roman"/>
+                      <w:color w:val="000000"/>
+                      <w:sz w:val="24"/>
+                      <w:szCs w:val="24"/>
+                      <w:highlight w:val="white"/>
+                      <w:lang w:val="ru-RU"/>
+                    </w:rPr>
+                    <w:t xml:space="preserve">Представитель </w:t>
+                  </w:r>
+                  <w:r>
+                    <w:rPr>
+                      <w:rFonts w:ascii="Times New Roman" w:hAnsi="Times New Roman"/>
+                      <w:color w:val="000000"/>
+                      <w:sz w:val="24"/>
+                      <w:szCs w:val="24"/>
+                      <w:highlight w:val="white"/>
+                      <w:lang w:val="ru-RU"/>
+                    </w:rPr>
+                    <w:t>Романенко Т.А.</w:t>
                   </w:r>
                 </w:p>
                 <w:p>
@@ -4877,57 +4961,6 @@
                 <w:p>
                   <w:pPr>
                     <w:framePr w:hSpace="180" w:wrap="around" w:vAnchor="text" w:hAnchor="text" w:x="815" w:y="211"/>
-                    <w:ind w:right="-600"/>
-                    <w:jc w:val="both"/>
-                    <w:rPr>
-                      <w:rFonts w:ascii="Times New Roman" w:hAnsi="Times New Roman"/>
-                      <w:color w:val="000000"/>
-                      <w:sz w:val="24"/>
-                      <w:szCs w:val="24"/>
-                      <w:highlight w:val="white"/>
-                      <w:lang w:val="ru-RU"/>
-                    </w:rPr>
-                  </w:pPr>
-                  <w:r>
-                    <w:rPr>
-                      <w:rFonts w:ascii="Times New Roman" w:hAnsi="Times New Roman"/>
-                      <w:color w:val="000000"/>
-                      <w:sz w:val="24"/>
-                      <w:szCs w:val="24"/>
-                      <w:highlight w:val="white"/>
-                      <w:lang w:val="ru-RU"/>
-                    </w:rPr>
-                    <w:t xml:space="preserve">Представитель </w:t>
-                  </w:r>
-                  <w:r>
-                    <w:rPr>
-                      <w:rFonts w:ascii="Times New Roman" w:hAnsi="Times New Roman"/>
-                      <w:color w:val="000000"/>
-                      <w:sz w:val="24"/>
-                      <w:szCs w:val="24"/>
-                      <w:highlight w:val="white"/>
-                      <w:lang w:val="ru-RU"/>
-                    </w:rPr>
-                    <w:t>ИП Краковский КН</w:t>
-                  </w:r>
-                </w:p>
-                <w:p>
-                  <w:pPr>
-                    <w:framePr w:hSpace="180" w:wrap="around" w:vAnchor="text" w:hAnchor="text" w:x="815" w:y="211"/>
-                    <w:ind w:right="-600" w:firstLine="708"/>
-                    <w:jc w:val="both"/>
-                    <w:rPr>
-                      <w:rFonts w:ascii="Times New Roman" w:hAnsi="Times New Roman"/>
-                      <w:sz w:val="24"/>
-                      <w:szCs w:val="24"/>
-                      <w:highlight w:val="white"/>
-                      <w:lang w:val="ru-RU"/>
-                    </w:rPr>
-                  </w:pPr>
-                </w:p>
-                <w:p>
-                  <w:pPr>
-                    <w:framePr w:hSpace="180" w:wrap="around" w:vAnchor="text" w:hAnchor="text" w:x="815" w:y="211"/>
                     <w:ind w:right="-600" w:firstLine="708"/>
                     <w:jc w:val="both"/>
                     <w:rPr>
@@ -4973,7 +5006,7 @@
                       <w:highlight w:val="white"/>
                       <w:lang w:val="ru-RU"/>
                     </w:rPr>
-                    <w:t>К.Н. Краковский</w:t>
+                    <w:t>Т.А. Романенко</w:t>
                   </w:r>
                   <w:r>
                     <w:rPr>
@@ -5404,6 +5437,36 @@
                     </w:rPr>
                     <w:br/>
                   </w:r>
+                </w:p>
+                <w:p>
+                  <w:pPr>
+                    <w:framePr w:hSpace="180" w:wrap="around" w:vAnchor="text" w:hAnchor="text" w:x="815" w:y="211"/>
+                    <w:ind w:right="-600" w:firstLine="708"/>
+                    <w:jc w:val="both"/>
+                    <w:rPr>
+                      <w:rFonts w:ascii="Times New Roman" w:hAnsi="Times New Roman"/>
+                      <w:color w:val="000000"/>
+                      <w:sz w:val="24"/>
+                      <w:szCs w:val="24"/>
+                      <w:highlight w:val="white"/>
+                      <w:lang w:val="ru-RU"/>
+                    </w:rPr>
+                  </w:pPr>
+                </w:p>
+                <w:p>
+                  <w:pPr>
+                    <w:framePr w:hSpace="180" w:wrap="around" w:vAnchor="text" w:hAnchor="text" w:x="815" w:y="211"/>
+                    <w:ind w:right="-600" w:firstLine="708"/>
+                    <w:jc w:val="both"/>
+                    <w:rPr>
+                      <w:rFonts w:ascii="Times New Roman" w:hAnsi="Times New Roman"/>
+                      <w:color w:val="000000"/>
+                      <w:sz w:val="24"/>
+                      <w:szCs w:val="24"/>
+                      <w:highlight w:val="white"/>
+                      <w:lang w:val="ru-RU"/>
+                    </w:rPr>
+                  </w:pPr>
                 </w:p>
                 <w:p>
                   <w:pPr>

</xml_diff>